<commit_message>
this is change in terminology
</commit_message>
<xml_diff>
--- a/IncidentIQ Notes.docx
+++ b/IncidentIQ Notes.docx
@@ -112,7 +112,7 @@
     </w:p>
     <w:p>
       <w:r>
-        <w:t>Important honesty point: the current RCA engine is rule-based / AI-inspired, not a real LLM or machine-learning model. In interviews, call it “rule-based RCA” or “AI-inspired RCA with future LLM integration support.”</w:t>
+        <w:t>Important honesty point: the project now supports two RCA providers. The default rule-based engine uses predefined logic, while the optional Gemini mode sends collected telemetry to Google Gemini for structured analysis. In interviews, clearly explain which mode was used and mention the automatic rule-based fallback.</w:t>
       </w:r>
     </w:p>
     <w:p>
@@ -202,7 +202,7 @@
         <w:pStyle w:val="ListBullet"/>
       </w:pPr>
       <w:r>
-        <w:t>Generate a structured RCA report based on active incidents, metrics, logs, and history.</w:t>
+        <w:t>Generate a structured RCA report using either the local rule-based engine or optional Google Gemini analysis, with automatic fallback when Gemini is disabled, unavailable, invalid, or over the configured budget.</w:t>
       </w:r>
     </w:p>
     <w:p>
@@ -1093,6 +1093,38 @@
           </w:p>
         </w:tc>
       </w:tr>
+      <w:tr>
+        <w:tc>
+          <w:tcPr>
+            <w:tcW w:type="dxa" w:w="3485"/>
+          </w:tcPr>
+          <w:p>
+            <w:r>
+              <w:t>AI Provider</w:t>
+            </w:r>
+          </w:p>
+        </w:tc>
+        <w:tc>
+          <w:tcPr>
+            <w:tcW w:type="dxa" w:w="3485"/>
+          </w:tcPr>
+          <w:p>
+            <w:r>
+              <w:t>Google Gemini via @google/genai</w:t>
+            </w:r>
+          </w:p>
+        </w:tc>
+        <w:tc>
+          <w:tcPr>
+            <w:tcW w:type="dxa" w:w="3485"/>
+          </w:tcPr>
+          <w:p>
+            <w:r>
+              <w:t>Optional structured RCA generation with JSON output, usage metadata, and fallback support.</w:t>
+            </w:r>
+          </w:p>
+        </w:tc>
+      </w:tr>
     </w:tbl>
     <w:p/>
     <w:p>
@@ -1193,7 +1225,7 @@
         <w:pStyle w:val="CodeBlock"/>
       </w:pPr>
       <w:r>
-        <w:t>│   │   └── redis-ping.js</w:t>
+        <w:t>│   │   ├── redis-ping.js</w:t>
       </w:r>
     </w:p>
     <w:p>
@@ -1201,6 +1233,14 @@
         <w:pStyle w:val="CodeBlock"/>
       </w:pPr>
       <w:r>
+        <w:t>│   │   └── gemini-test.js</w:t>
+      </w:r>
+    </w:p>
+    <w:p>
+      <w:pPr>
+        <w:pStyle w:val="CodeBlock"/>
+      </w:pPr>
+      <w:r>
         <w:t>│   └── src/</w:t>
       </w:r>
     </w:p>
@@ -1316,6 +1356,7 @@
         <w:t>│       │   ├── Metric.js</w:t>
       </w:r>
     </w:p>
+    <w:p/>
     <w:p>
       <w:pPr>
         <w:pStyle w:val="CodeBlock"/>
@@ -1329,6 +1370,14 @@
         <w:pStyle w:val="CodeBlock"/>
       </w:pPr>
       <w:r>
+        <w:t>│       │   ├── AIUsage.js</w:t>
+      </w:r>
+    </w:p>
+    <w:p>
+      <w:pPr>
+        <w:pStyle w:val="CodeBlock"/>
+      </w:pPr>
+      <w:r>
         <w:t>│       │   └── Service.js</w:t>
       </w:r>
     </w:p>
@@ -1450,6 +1499,14 @@
       </w:pPr>
       <w:r>
         <w:t>│       │   ├── rcaEngine.service.js</w:t>
+      </w:r>
+    </w:p>
+    <w:p>
+      <w:pPr>
+        <w:pStyle w:val="CodeBlock"/>
+      </w:pPr>
+      <w:r>
+        <w:t>│       │   ├── gemini.service.js</w:t>
       </w:r>
     </w:p>
     <w:p>
@@ -2319,6 +2376,72 @@
                 <w:sz w:val="17"/>
               </w:rPr>
               <w:t>Utility helpers such as random number and clamp functions.</w:t>
+            </w:r>
+          </w:p>
+        </w:tc>
+      </w:tr>
+      <w:tr>
+        <w:tc>
+          <w:tcPr>
+            <w:tcW w:type="dxa" w:w="5227"/>
+          </w:tcPr>
+          <w:p>
+            <w:r>
+              <w:t>src/services/gemini.service.js</w:t>
+            </w:r>
+          </w:p>
+        </w:tc>
+        <w:tc>
+          <w:tcPr>
+            <w:tcW w:type="dxa" w:w="5227"/>
+          </w:tcPr>
+          <w:p>
+            <w:r>
+              <w:t>Creates the Gemini client, builds the incident-analysis prompt, requests JSON output, validates the response shape, records token usage, and reports provider availability.</w:t>
+            </w:r>
+          </w:p>
+        </w:tc>
+      </w:tr>
+      <w:tr>
+        <w:tc>
+          <w:tcPr>
+            <w:tcW w:type="dxa" w:w="5227"/>
+          </w:tcPr>
+          <w:p>
+            <w:r>
+              <w:t>src/models/AIUsage.js</w:t>
+            </w:r>
+          </w:p>
+        </w:tc>
+        <w:tc>
+          <w:tcPr>
+            <w:tcW w:type="dxa" w:w="5227"/>
+          </w:tcPr>
+          <w:p>
+            <w:r>
+              <w:t>Stores daily Gemini request counts, prompt/output/total tokens, fallback counts, last error, and last-used timestamp.</w:t>
+            </w:r>
+          </w:p>
+        </w:tc>
+      </w:tr>
+      <w:tr>
+        <w:tc>
+          <w:tcPr>
+            <w:tcW w:type="dxa" w:w="5227"/>
+          </w:tcPr>
+          <w:p>
+            <w:r>
+              <w:t>scripts/gemini-test.js</w:t>
+            </w:r>
+          </w:p>
+        </w:tc>
+        <w:tc>
+          <w:tcPr>
+            <w:tcW w:type="dxa" w:w="5227"/>
+          </w:tcPr>
+          <w:p>
+            <w:r>
+              <w:t>Performs a small command-line Gemini connectivity test using the configured API key and model.</w:t>
             </w:r>
           </w:p>
         </w:tc>
@@ -3412,6 +3535,28 @@
                 <w:sz w:val="17"/>
               </w:rPr>
               <w:t>Generated root cause, affected services, impact, evidence, fixes, prevention steps, and raw summary.</w:t>
+            </w:r>
+          </w:p>
+        </w:tc>
+      </w:tr>
+      <w:tr>
+        <w:tc>
+          <w:tcPr>
+            <w:tcW w:type="dxa" w:w="5227"/>
+          </w:tcPr>
+          <w:p>
+            <w:r>
+              <w:t>AIUsage</w:t>
+            </w:r>
+          </w:p>
+        </w:tc>
+        <w:tc>
+          <w:tcPr>
+            <w:tcW w:type="dxa" w:w="5227"/>
+          </w:tcPr>
+          <w:p>
+            <w:r>
+              <w:t>Daily Gemini usage counters, token totals, fallback count, last provider error, and last-used time.</w:t>
             </w:r>
           </w:p>
         </w:tc>
@@ -5322,6 +5467,38 @@
           </w:p>
         </w:tc>
       </w:tr>
+      <w:tr>
+        <w:tc>
+          <w:tcPr>
+            <w:tcW w:type="dxa" w:w="3485"/>
+          </w:tcPr>
+          <w:p>
+            <w:r>
+              <w:t>GET</w:t>
+            </w:r>
+          </w:p>
+        </w:tc>
+        <w:tc>
+          <w:tcPr>
+            <w:tcW w:type="dxa" w:w="3485"/>
+          </w:tcPr>
+          <w:p>
+            <w:r>
+              <w:t>/api/rca/quota</w:t>
+            </w:r>
+          </w:p>
+        </w:tc>
+        <w:tc>
+          <w:tcPr>
+            <w:tcW w:type="dxa" w:w="3485"/>
+          </w:tcPr>
+          <w:p>
+            <w:r>
+              <w:t>Return Gemini configuration and availability status for the RCA page.</w:t>
+            </w:r>
+          </w:p>
+        </w:tc>
+      </w:tr>
     </w:tbl>
     <w:p/>
     <w:p>
@@ -8250,7 +8427,7 @@
     </w:p>
     <w:p>
       <w:r>
-        <w:t>The RCA engine is rule-based. It collects active incidents, current service state, recent logs from Redis, and recently resolved incidents from MongoDB. Then it creates a structured report.</w:t>
+        <w:t>The RCA subsystem now supports two providers: a deterministic rule-based engine and an optional Google Gemini integration. Both use the same collected context—active incidents, current service state, recent Redis logs, and recently resolved MongoDB incidents—and produce the same structured RCA report shape.</w:t>
       </w:r>
     </w:p>
     <w:p>
@@ -8447,7 +8624,163 @@
         <w:pStyle w:val="CodeBlock"/>
       </w:pPr>
       <w:r>
-        <w:t>I built a rule-based RCA engine inspired by AI incident-analysis workflows. It correlates active incidents, service telemetry, recent error logs, and historical failures to generate a structured root-cause report. The architecture can later be extended with an LLM provider.</w:t>
+        <w:t>I built a dual-provider RCA pipeline. The local rule-based engine provides deterministic analysis, while the optional Gemini integration sends sanitized incident context to Google Gemini and validates the returned JSON. If Gemini is disabled or fails, the system automatically falls back to the rule-based engine and records the reason.</w:t>
+      </w:r>
+    </w:p>
+    <w:p>
+      <w:pPr>
+        <w:pStyle w:val="Heading2"/>
+      </w:pPr>
+      <w:r>
+        <w:t>Provider selection</w:t>
+      </w:r>
+    </w:p>
+    <w:p>
+      <w:pPr/>
+      <w:r>
+        <w:t>The frontend RCA page presents Rule-Based and Gemini AI toggle options. It sends POST /api/rca/generate with { "provider": "rule-based" } or { "provider": "gemini" }. Gemini is disabled in the UI when no API key is configured.</w:t>
+      </w:r>
+    </w:p>
+    <w:p>
+      <w:pPr>
+        <w:pStyle w:val="Heading2"/>
+      </w:pPr>
+      <w:r>
+        <w:t>Shared context collection</w:t>
+      </w:r>
+    </w:p>
+    <w:p>
+      <w:pPr/>
+      <w:r>
+        <w:t>rcaEngine.service.js collects active runtime incidents, public service telemetry with control keys removed, the 30 most recent cached logs, and the 10 most recently resolved incidents. This same context is used by both providers.</w:t>
+      </w:r>
+    </w:p>
+    <w:p>
+      <w:pPr>
+        <w:pStyle w:val="Heading2"/>
+      </w:pPr>
+      <w:r>
+        <w:t>Gemini generation flow</w:t>
+      </w:r>
+    </w:p>
+    <w:p>
+      <w:pPr>
+        <w:pStyle w:val="CodeBlock"/>
+      </w:pPr>
+      <w:r>
+        <w:t>POST /api/rca/generate { provider: "gemini" }</w:t>
+        <w:br/>
+        <w:t xml:space="preserve">        |</w:t>
+        <w:br/>
+        <w:t xml:space="preserve">        v</w:t>
+        <w:br/>
+        <w:t>rcaEngine.generateRCA("gemini")</w:t>
+        <w:br/>
+        <w:t xml:space="preserve">        |-- collect sanitized telemetry context</w:t>
+        <w:br/>
+        <w:t xml:space="preserve">        |-- confirm USE_REAL_AI=true</w:t>
+        <w:br/>
+        <w:t xml:space="preserve">        |-- check configured daily request/token budget</w:t>
+        <w:br/>
+        <w:t xml:space="preserve">        |-- call Google Gemini using @google/genai</w:t>
+        <w:br/>
+        <w:t xml:space="preserve">        |-- request application/json with temperature 0.2</w:t>
+        <w:br/>
+        <w:t xml:space="preserve">        |-- validate required strings and arrays</w:t>
+        <w:br/>
+        <w:t xml:space="preserve">        |-- store token usage and provider metadata</w:t>
+        <w:br/>
+        <w:t xml:space="preserve">        v</w:t>
+        <w:br/>
+        <w:t>Save RCAReport and emit rca:generated</w:t>
+      </w:r>
+    </w:p>
+    <w:p>
+      <w:pPr>
+        <w:pStyle w:val="Heading2"/>
+      </w:pPr>
+      <w:r>
+        <w:t>Required Gemini JSON contract</w:t>
+      </w:r>
+    </w:p>
+    <w:p>
+      <w:pPr>
+        <w:pStyle w:val="CodeBlock"/>
+      </w:pPr>
+      <w:r>
+        <w:t>{</w:t>
+        <w:br/>
+        <w:t xml:space="preserve">  "rootCause": "concise root cause",</w:t>
+        <w:br/>
+        <w:t xml:space="preserve">  "affectedServices": ["service"],</w:t>
+        <w:br/>
+        <w:t xml:space="preserve">  "impact": "user/business impact",</w:t>
+        <w:br/>
+        <w:t xml:space="preserve">  "evidence": ["specific evidence"],</w:t>
+        <w:br/>
+        <w:t xml:space="preserve">  "suggestedFixes": ["actionable fix"],</w:t>
+        <w:br/>
+        <w:t xml:space="preserve">  "preventionSteps": ["prevention step"],</w:t>
+        <w:br/>
+        <w:t xml:space="preserve">  "rawSummary": "brief combined summary"</w:t>
+        <w:br/>
+        <w:t>}</w:t>
+      </w:r>
+    </w:p>
+    <w:p>
+      <w:pPr>
+        <w:pStyle w:val="Heading2"/>
+      </w:pPr>
+      <w:r>
+        <w:t>Usage tracking and budget guard</w:t>
+      </w:r>
+    </w:p>
+    <w:p>
+      <w:pPr/>
+      <w:r>
+        <w:t>AIUsage stores daily requestCount, promptTokens, outputTokens, totalTokens, fallbackCount, lastUsedAt, and lastError. GEMINI_DAILY_REQUEST_LIMIT and GEMINI_DAILY_TOKEN_LIMIT act as application-level safety budgets. These are locally configured limits, not a live reading of the provider account quota.</w:t>
+      </w:r>
+    </w:p>
+    <w:p>
+      <w:pPr>
+        <w:pStyle w:val="Heading2"/>
+      </w:pPr>
+      <w:r>
+        <w:t>Automatic fallback</w:t>
+      </w:r>
+    </w:p>
+    <w:p>
+      <w:pPr/>
+      <w:r>
+        <w:t>If Gemini is disabled, the API key is missing, the configured budget is exhausted, the provider call fails, or the response cannot be parsed into the required schema, IncidentIQ generates the report with the rule-based engine. RCAReport records requestedProvider, generatedBy, model, usage, and fallbackReason so the UI can show what actually happened.</w:t>
+      </w:r>
+    </w:p>
+    <w:p>
+      <w:pPr>
+        <w:pStyle w:val="Heading2"/>
+      </w:pPr>
+      <w:r>
+        <w:t>Frontend behavior</w:t>
+      </w:r>
+    </w:p>
+    <w:p>
+      <w:pPr/>
+      <w:r>
+        <w:t>The RCA page loads GET /api/rca/quota to show Gemini availability, labels each report as Rule-Based or Gemini AI with its model, displays a warning when fallback occurred, and continues receiving rca:generated events through Socket.IO.</w:t>
+      </w:r>
+    </w:p>
+    <w:p>
+      <w:pPr>
+        <w:pStyle w:val="Heading2"/>
+      </w:pPr>
+      <w:r>
+        <w:t>Security and privacy note</w:t>
+      </w:r>
+    </w:p>
+    <w:p>
+      <w:pPr/>
+      <w:r>
+        <w:t>Gemini mode sends incident context to an external AI provider. Production use should minimize or redact secrets, credentials, personal data, proprietary payloads, and unrestricted logs before transmission. API keys must remain in environment variables and must never be committed.</w:t>
       </w:r>
     </w:p>
     <w:p>
@@ -8778,6 +9111,13 @@
       </w:pPr>
       <w:r>
         <w:t># Terminal 1: backend</w:t>
+        <w:br/>
+        <w:br/>
+        <w:t># Optional: verify Gemini connection</w:t>
+        <w:br/>
+        <w:t>cd backend</w:t>
+        <w:br/>
+        <w:t>npm run gemini:test</w:t>
       </w:r>
     </w:p>
     <w:p>
@@ -9005,7 +9345,7 @@
         <w:pStyle w:val="CodeBlock"/>
       </w:pPr>
       <w:r>
-        <w:t>- Developed a rule-based RCA engine that correlates active incidents, service metrics, recent error logs, and historical incidents to generate root-cause summaries and remediation steps.</w:t>
+        <w:t>- Developed a dual-provider RCA pipeline with deterministic rule-based analysis and optional Google Gemini integration, including structured JSON validation, token-usage tracking, daily budget controls, and automatic fallback.</w:t>
       </w:r>
     </w:p>
     <w:p>
@@ -9029,7 +9369,7 @@
         <w:pStyle w:val="ListBullet"/>
       </w:pPr>
       <w:r>
-        <w:t>Avoid: “Built an AI-powered incident platform” if you did not integrate real AI.</w:t>
+        <w:t>Avoid: “The RCA is always AI-generated.” Gemini is optional, and the system may intentionally use or fall back to the rule-based provider.</w:t>
       </w:r>
     </w:p>
     <w:p>
@@ -9061,7 +9401,7 @@
         <w:pStyle w:val="ListBullet"/>
       </w:pPr>
       <w:r>
-        <w:t>“AI-inspired rule-based RCA engine.”</w:t>
+        <w:t>“Dual-provider RCA engine with optional Gemini analysis and rule-based fallback.”</w:t>
       </w:r>
     </w:p>
     <w:p>
@@ -9610,16 +9950,8 @@
             <w:vAlign w:val="top"/>
           </w:tcPr>
           <w:p>
-            <w:pPr>
-              <w:spacing w:after="0"/>
-            </w:pPr>
-            <w:r/>
             <w:r>
-              <w:rPr>
-                <w:b w:val="0"/>
-                <w:sz w:val="17"/>
-              </w:rPr>
-              <w:t>Rule-based RCA, not real AI</w:t>
+              <w:t>Gemini output can be unavailable or inconsistent</w:t>
             </w:r>
           </w:p>
         </w:tc>
@@ -9629,16 +9961,8 @@
             <w:vAlign w:val="top"/>
           </w:tcPr>
           <w:p>
-            <w:pPr>
-              <w:spacing w:after="0"/>
-            </w:pPr>
-            <w:r/>
             <w:r>
-              <w:rPr>
-                <w:b w:val="0"/>
-                <w:sz w:val="17"/>
-              </w:rPr>
-              <w:t>Can look like overclaiming if called AI-powered.</w:t>
+              <w:t>External AI calls can fail, exceed budgets, or return invalid structure.</w:t>
             </w:r>
           </w:p>
         </w:tc>
@@ -9648,16 +9972,8 @@
             <w:vAlign w:val="top"/>
           </w:tcPr>
           <w:p>
-            <w:pPr>
-              <w:spacing w:after="0"/>
-            </w:pPr>
-            <w:r/>
             <w:r>
-              <w:rPr>
-                <w:b w:val="0"/>
-                <w:sz w:val="17"/>
-              </w:rPr>
-              <w:t>Call it AI-inspired/rule-based. Later integrate LLM behind USE_REAL_AI.</w:t>
+              <w:t>Validate the JSON shape, track usage, show provider/fallback metadata, and automatically use the deterministic rule-based engine.</w:t>
             </w:r>
           </w:p>
         </w:tc>
@@ -10159,7 +10475,7 @@
         <w:pStyle w:val="ListBullet"/>
       </w:pPr>
       <w:r>
-        <w:t>LLM integration for RCA using a real AI provider.</w:t>
+        <w:t>Improve Gemini prompt evaluation, schema enforcement, privacy controls, retry strategy, and provider observability.</w:t>
       </w:r>
     </w:p>
     <w:p>
@@ -10256,7 +10572,7 @@
         <w:pStyle w:val="CodeBlock"/>
       </w:pPr>
       <w:r>
-        <w:t>The RCA engine is rule-based. It correlates active incidents, service telemetry, recent logs, and historical incidents to generate root-cause summaries and remediation steps.</w:t>
+        <w:t>The RCA subsystem supports both rule-based and Gemini modes. It gathers active incidents, service telemetry, recent logs, and historical incidents. Gemini mode requests structured JSON analysis; invalid responses or provider failures trigger an automatic rule-based fallback.</w:t>
       </w:r>
     </w:p>
     <w:p>
@@ -10329,7 +10645,7 @@
     </w:p>
     <w:p>
       <w:r>
-        <w:t>Currently it is rule-based and AI-inspired. It collects active incidents, metrics, recent logs, and historical incidents, then generates structured root cause, evidence, impact, fixes, and prevention steps. I kept the design extendable so a real LLM provider can be added later.</w:t>
+        <w:t>It supports both modes. Rule-Based mode uses predefined local logic. Gemini mode uses the @google/genai SDK to analyze the same telemetry and return structured JSON. The response is validated, usage is recorded, and any failure falls back to the local engine. So I describe it as an optional Gemini-powered RCA integration with a reliable rule-based fallback—not as a trained custom model.</w:t>
       </w:r>
     </w:p>
     <w:p>
@@ -10381,7 +10697,7 @@
     </w:p>
     <w:p>
       <w:r>
-        <w:t>Docker Compose, tests, authentication, real screenshots/demo, worker-based background jobs, metric retention, and optional LLM-based RCA integration.</w:t>
+        <w:t>Docker Compose, tests, authentication, real screenshots/demo, worker-based background jobs, metric retention, stronger Gemini response validation, retries, privacy filtering, and provider-level monitoring.</w:t>
       </w:r>
     </w:p>
     <w:p>

</xml_diff>